<commit_message>
AAMJAF final package: cut to 6,950 words, Appendix B, single author
Co-Authored-By: Claude Opus 5.5 <noreply@anthropic.com>
Claude-Session: https://claude.ai/code/session_01H8HDPH7cZ4HRFFk99Dk3WW
</commit_message>
<xml_diff>
--- a/submission/AAMJAF_submission/01_Cover_Page.docx
+++ b/submission/AAMJAF_submission/01_Cover_Page.docx
@@ -22,75 +22,13 @@
       </w:pPr>
       <w:r>
         <w:rPr/>
-        <w:t>Nguyen Thanh Binh</w:t>
+        <w:t>Nguyen Van Trung</w:t>
       </w:r>
       <w:r>
         <w:rPr>
           <w:vertAlign w:val="superscript"/>
         </w:rPr>
-        <w:t>a</w:t>
-      </w:r>
-      <w:r>
-        <w:rPr/>
-        <w:t>, Nguyen Van Trung</w:t>
-      </w:r>
-      <w:r>
-        <w:rPr>
-          <w:vertAlign w:val="superscript"/>
-        </w:rPr>
-        <w:t>a,</w:t>
-      </w:r>
-      <w:r>
-        <w:rPr/>
-        <w:t>*, Ha Hong Hanh</w:t>
-      </w:r>
-      <w:r>
-        <w:rPr>
-          <w:vertAlign w:val="superscript"/>
-        </w:rPr>
-        <w:t>b</w:t>
-      </w:r>
-      <w:r>
-        <w:rPr/>
-        <w:t>, Nguyen Bach Diep</w:t>
-      </w:r>
-      <w:r>
-        <w:rPr>
-          <w:vertAlign w:val="superscript"/>
-        </w:rPr>
-        <w:t>a</w:t>
-      </w:r>
-    </w:p>
-    <w:p>
-      <w:pPr>
-        <w:spacing w:line="240" w:lineRule="auto" w:after="80" w:before="0"/>
-        <w:jc w:val="center"/>
-      </w:pPr>
-      <w:r>
-        <w:rPr>
-          <w:vertAlign w:val="superscript"/>
-        </w:rPr>
-        <w:t>a</w:t>
-      </w:r>
-      <w:r>
-        <w:rPr/>
-        <w:t xml:space="preserve"> Academy of Policy and Development, Nam An Khanh Urban Area, Hoai Duc District, Hanoi, Vietnam</w:t>
-      </w:r>
-    </w:p>
-    <w:p>
-      <w:pPr>
-        <w:spacing w:line="240" w:lineRule="auto" w:after="80" w:before="0"/>
-        <w:jc w:val="center"/>
-      </w:pPr>
-      <w:r>
-        <w:rPr>
-          <w:vertAlign w:val="superscript"/>
-        </w:rPr>
-        <w:t>b</w:t>
-      </w:r>
-      <w:r>
-        <w:rPr/>
-        <w:t xml:space="preserve"> School of Accounting and Auditing, National Economics University, Hanoi, Vietnam</w:t>
+        <w:t>*</w:t>
       </w:r>
     </w:p>
     <w:p>
@@ -100,7 +38,7 @@
       </w:pPr>
       <w:r>
         <w:rPr/>
-        <w:t>* Corresponding author: Nguyen Van Trung, Academy of Policy and Development, Nam An Khanh Urban Area, Hoai Duc District, Hanoi, Vietnam. Email: kontrungcany@gmail.com. Tel: +84 355 347 831.</w:t>
+        <w:t>International School, Vietnam National University, Hanoi, 144 Xuan Thuy Street, Cau Giay District, Hanoi, Vietnam</w:t>
       </w:r>
     </w:p>
     <w:p>
@@ -110,37 +48,7 @@
       </w:pPr>
       <w:r>
         <w:rPr/>
-        <w:t>Nguyen Thanh Binh: nguyenthanhbinhapd@apd.edu.vn; ORCID 0009-0007-0042-2835</w:t>
-      </w:r>
-    </w:p>
-    <w:p>
-      <w:pPr>
-        <w:spacing w:line="240" w:lineRule="auto" w:after="80" w:before="0"/>
-        <w:jc w:val="center"/>
-      </w:pPr>
-      <w:r>
-        <w:rPr/>
-        <w:t>Nguyen Van Trung: kontrungcany@gmail.com; ORCID 0009-0008-3307-6569</w:t>
-      </w:r>
-    </w:p>
-    <w:p>
-      <w:pPr>
-        <w:spacing w:line="240" w:lineRule="auto" w:after="80" w:before="0"/>
-        <w:jc w:val="center"/>
-      </w:pPr>
-      <w:r>
-        <w:rPr/>
-        <w:t>Ha Hong Hanh: hanhhh@neu.edu.vn; ORCID 0000-0003-3581-6571</w:t>
-      </w:r>
-    </w:p>
-    <w:p>
-      <w:pPr>
-        <w:spacing w:line="240" w:lineRule="auto" w:after="80" w:before="0"/>
-        <w:jc w:val="center"/>
-      </w:pPr>
-      <w:r>
-        <w:rPr/>
-        <w:t>Nguyen Bach Diep: diepnb@apd.edu.vn; ORCID 0009-0003-0967-7528</w:t>
+        <w:t>* Corresponding author: Nguyen Van Trung, International School, Vietnam National University, Hanoi, 144 Xuan Thuy Street, Cau Giay District, Hanoi, Vietnam. Email: kontrungcany@gmail.com. Tel: +84 355 347 831. ORCID 0009-0008-3307-6569.</w:t>
       </w:r>
     </w:p>
     <w:p>
@@ -162,7 +70,7 @@
       </w:pPr>
       <w:r>
         <w:rPr/>
-        <w:t>None.</w:t>
+        <w:t>The author thanks a native English-speaking editor for language editing of the manuscript.</w:t>
       </w:r>
     </w:p>
     <w:p>
@@ -206,7 +114,7 @@
       </w:pPr>
       <w:r>
         <w:rPr/>
-        <w:t>The ESG scores (LSEG Workspace) and the accounting and market data (Compustat Global) are licensed, and the licences do not allow the authors to redistribute them, including firm identifiers and derived firm-level variables; the download date of the scores was not recorded. The R code, the pre-analysis plan, and all aggregate output files are supplied as supporting material with this submission and will be deposited in a public repository upon acceptance. Researchers with access to the two databases can rebuild the sample with the code.</w:t>
+        <w:t>The ESG scores (LSEG Workspace) and the accounting and market data (Compustat Global) are licensed, and the licences do not allow the author to redistribute them, including firm identifiers and derived firm-level variables; the download date of the scores was not recorded. The R code, the pre-analysis plan, and all aggregate output files are available from the author on request and will be deposited in a public repository upon acceptance. Researchers with access to the two databases can rebuild the sample with the code.</w:t>
       </w:r>
     </w:p>
     <w:p>
@@ -228,7 +136,7 @@
       </w:pPr>
       <w:r>
         <w:rPr/>
-        <w:t>Nguyen Thanh Binh has nothing to disclose. Nguyen Van Trung has nothing to disclose. Ha Hong Hanh has nothing to disclose. Nguyen Bach Diep has nothing to disclose.</w:t>
+        <w:t>The author has nothing to disclose.</w:t>
       </w:r>
     </w:p>
     <w:p>
@@ -272,7 +180,7 @@
       </w:pPr>
       <w:r>
         <w:rPr/>
-        <w:t>Nguyen Thanh Binh: Conceptualization, Supervision, Writing (review and editing). Nguyen Van Trung: Conceptualization, Data curation, Formal analysis, Methodology, Software, Visualization, Writing (original draft). Ha Hong Hanh: Methodology, Validation, Writing (review and editing). Nguyen Bach Diep: Data curation, Validation, Writing (review and editing).</w:t>
+        <w:t>Nguyen Van Trung is the sole author and carried out the conceptualization, data curation, formal analysis, methodology, software, visualization, and writing.</w:t>
       </w:r>
     </w:p>
     <w:p>
@@ -294,7 +202,7 @@
       </w:pPr>
       <w:r>
         <w:rPr/>
-        <w:t>The authors used Claude (Anthropic), through Claude Code, in September and October 2026 to screen research questions, draft the pre-analysis plan, write the R code, edit and revise the text, check references, and simulate referee reports. The authors reviewed every output, checked each reported number against the R output files, and take full responsibility for the content.</w:t>
+        <w:t>The author used Claude (Anthropic), through Claude Code, in September and October 2026 to screen research questions, draft the pre-analysis plan, write the R code, edit and revise the text, check references, and simulate referee reports. The author reviewed every output, checked each reported number against the R output files, and takes full responsibility for the content.</w:t>
       </w:r>
     </w:p>
     <w:sectPr>

</xml_diff>